<commit_message>
Updated code and docs, added shopping list file
</commit_message>
<xml_diff>
--- a/FYP Controller Design.docx
+++ b/FYP Controller Design.docx
@@ -81,7 +81,7 @@
           <w:noProof/>
         </w:rPr>
         <w:drawing>
-          <wp:inline distT="0" distB="0" distL="0" distR="0" wp14:anchorId="13900A38" wp14:editId="4BFE583E">
+          <wp:inline distT="0" distB="0" distL="0" distR="0" wp14:anchorId="13900A38" wp14:editId="0DAAA404">
             <wp:extent cx="2138818" cy="2000250"/>
             <wp:effectExtent l="0" t="0" r="0" b="0"/>
             <wp:docPr id="1614353464" name="Picture 2" descr="8,163 Old Network Cable Stock Photos - Free &amp; Royalty-Free Stock Photos  from Dreamstime"/>
@@ -1656,16 +1656,16 @@
         <w:tblLook w:val="0000" w:firstRow="0" w:lastRow="0" w:firstColumn="0" w:lastColumn="0" w:noHBand="0" w:noVBand="0"/>
       </w:tblPr>
       <w:tblGrid>
-        <w:gridCol w:w="2832"/>
-        <w:gridCol w:w="1190"/>
+        <w:gridCol w:w="2932"/>
+        <w:gridCol w:w="1232"/>
       </w:tblGrid>
       <w:tr>
         <w:trPr>
-          <w:trHeight w:val="355"/>
+          <w:trHeight w:val="375"/>
         </w:trPr>
         <w:tc>
           <w:tcPr>
-            <w:tcW w:w="2832" w:type="dxa"/>
+            <w:tcW w:w="2932" w:type="dxa"/>
             <w:tcBorders>
               <w:top w:val="nil"/>
               <w:left w:val="nil"/>
@@ -1701,7 +1701,7 @@
         </w:tc>
         <w:tc>
           <w:tcPr>
-            <w:tcW w:w="1190" w:type="dxa"/>
+            <w:tcW w:w="1232" w:type="dxa"/>
             <w:tcBorders>
               <w:top w:val="nil"/>
               <w:left w:val="nil"/>
@@ -1729,11 +1729,11 @@
       </w:tr>
       <w:tr>
         <w:trPr>
-          <w:trHeight w:val="305"/>
+          <w:trHeight w:val="321"/>
         </w:trPr>
         <w:tc>
           <w:tcPr>
-            <w:tcW w:w="2832" w:type="dxa"/>
+            <w:tcW w:w="2932" w:type="dxa"/>
             <w:tcBorders>
               <w:top w:val="nil"/>
               <w:left w:val="nil"/>
@@ -1760,7 +1760,7 @@
         </w:tc>
         <w:tc>
           <w:tcPr>
-            <w:tcW w:w="1190" w:type="dxa"/>
+            <w:tcW w:w="1232" w:type="dxa"/>
             <w:tcBorders>
               <w:top w:val="nil"/>
               <w:left w:val="nil"/>
@@ -1788,11 +1788,11 @@
       </w:tr>
       <w:tr>
         <w:trPr>
-          <w:trHeight w:val="305"/>
+          <w:trHeight w:val="321"/>
         </w:trPr>
         <w:tc>
           <w:tcPr>
-            <w:tcW w:w="2832" w:type="dxa"/>
+            <w:tcW w:w="2932" w:type="dxa"/>
             <w:tcBorders>
               <w:top w:val="nil"/>
               <w:left w:val="nil"/>
@@ -1833,7 +1833,7 @@
         </w:tc>
         <w:tc>
           <w:tcPr>
-            <w:tcW w:w="1190" w:type="dxa"/>
+            <w:tcW w:w="1232" w:type="dxa"/>
             <w:tcBorders>
               <w:top w:val="nil"/>
               <w:left w:val="nil"/>
@@ -1875,11 +1875,11 @@
       </w:tr>
       <w:tr>
         <w:trPr>
-          <w:trHeight w:val="305"/>
+          <w:trHeight w:val="321"/>
         </w:trPr>
         <w:tc>
           <w:tcPr>
-            <w:tcW w:w="2832" w:type="dxa"/>
+            <w:tcW w:w="2932" w:type="dxa"/>
             <w:tcBorders>
               <w:top w:val="nil"/>
               <w:left w:val="nil"/>
@@ -1915,7 +1915,7 @@
         </w:tc>
         <w:tc>
           <w:tcPr>
-            <w:tcW w:w="1190" w:type="dxa"/>
+            <w:tcW w:w="1232" w:type="dxa"/>
             <w:tcBorders>
               <w:top w:val="nil"/>
               <w:left w:val="nil"/>
@@ -1953,11 +1953,11 @@
       </w:tr>
       <w:tr>
         <w:trPr>
-          <w:trHeight w:val="305"/>
+          <w:trHeight w:val="321"/>
         </w:trPr>
         <w:tc>
           <w:tcPr>
-            <w:tcW w:w="2832" w:type="dxa"/>
+            <w:tcW w:w="2932" w:type="dxa"/>
             <w:tcBorders>
               <w:top w:val="nil"/>
               <w:left w:val="nil"/>
@@ -1993,7 +1993,7 @@
         </w:tc>
         <w:tc>
           <w:tcPr>
-            <w:tcW w:w="1190" w:type="dxa"/>
+            <w:tcW w:w="1232" w:type="dxa"/>
             <w:tcBorders>
               <w:top w:val="nil"/>
               <w:left w:val="nil"/>
@@ -2031,11 +2031,11 @@
       </w:tr>
       <w:tr>
         <w:trPr>
-          <w:trHeight w:val="305"/>
+          <w:trHeight w:val="321"/>
         </w:trPr>
         <w:tc>
           <w:tcPr>
-            <w:tcW w:w="2832" w:type="dxa"/>
+            <w:tcW w:w="2932" w:type="dxa"/>
             <w:tcBorders>
               <w:top w:val="nil"/>
               <w:left w:val="nil"/>
@@ -2071,7 +2071,7 @@
         </w:tc>
         <w:tc>
           <w:tcPr>
-            <w:tcW w:w="1190" w:type="dxa"/>
+            <w:tcW w:w="1232" w:type="dxa"/>
             <w:tcBorders>
               <w:top w:val="nil"/>
               <w:left w:val="nil"/>
@@ -2109,11 +2109,11 @@
       </w:tr>
       <w:tr>
         <w:trPr>
-          <w:trHeight w:val="305"/>
+          <w:trHeight w:val="321"/>
         </w:trPr>
         <w:tc>
           <w:tcPr>
-            <w:tcW w:w="2832" w:type="dxa"/>
+            <w:tcW w:w="2932" w:type="dxa"/>
             <w:tcBorders>
               <w:top w:val="nil"/>
               <w:left w:val="nil"/>
@@ -2149,7 +2149,7 @@
         </w:tc>
         <w:tc>
           <w:tcPr>
-            <w:tcW w:w="1190" w:type="dxa"/>
+            <w:tcW w:w="1232" w:type="dxa"/>
             <w:tcBorders>
               <w:top w:val="nil"/>
               <w:left w:val="nil"/>
@@ -2187,11 +2187,11 @@
       </w:tr>
       <w:tr>
         <w:trPr>
-          <w:trHeight w:val="305"/>
+          <w:trHeight w:val="321"/>
         </w:trPr>
         <w:tc>
           <w:tcPr>
-            <w:tcW w:w="2832" w:type="dxa"/>
+            <w:tcW w:w="2932" w:type="dxa"/>
             <w:tcBorders>
               <w:top w:val="nil"/>
               <w:left w:val="nil"/>
@@ -2227,7 +2227,7 @@
         </w:tc>
         <w:tc>
           <w:tcPr>
-            <w:tcW w:w="1190" w:type="dxa"/>
+            <w:tcW w:w="1232" w:type="dxa"/>
             <w:tcBorders>
               <w:top w:val="nil"/>
               <w:left w:val="nil"/>
@@ -2265,11 +2265,11 @@
       </w:tr>
       <w:tr>
         <w:trPr>
-          <w:trHeight w:val="305"/>
+          <w:trHeight w:val="321"/>
         </w:trPr>
         <w:tc>
           <w:tcPr>
-            <w:tcW w:w="2832" w:type="dxa"/>
+            <w:tcW w:w="2932" w:type="dxa"/>
             <w:tcBorders>
               <w:top w:val="nil"/>
               <w:left w:val="nil"/>
@@ -2305,7 +2305,7 @@
         </w:tc>
         <w:tc>
           <w:tcPr>
-            <w:tcW w:w="1190" w:type="dxa"/>
+            <w:tcW w:w="1232" w:type="dxa"/>
             <w:tcBorders>
               <w:top w:val="nil"/>
               <w:left w:val="nil"/>
@@ -2343,11 +2343,11 @@
       </w:tr>
       <w:tr>
         <w:trPr>
-          <w:trHeight w:val="305"/>
+          <w:trHeight w:val="321"/>
         </w:trPr>
         <w:tc>
           <w:tcPr>
-            <w:tcW w:w="2832" w:type="dxa"/>
+            <w:tcW w:w="2932" w:type="dxa"/>
             <w:tcBorders>
               <w:top w:val="nil"/>
               <w:left w:val="nil"/>
@@ -2383,7 +2383,7 @@
         </w:tc>
         <w:tc>
           <w:tcPr>
-            <w:tcW w:w="1190" w:type="dxa"/>
+            <w:tcW w:w="1232" w:type="dxa"/>
             <w:tcBorders>
               <w:top w:val="nil"/>
               <w:left w:val="nil"/>
@@ -2421,11 +2421,11 @@
       </w:tr>
       <w:tr>
         <w:trPr>
-          <w:trHeight w:val="305"/>
+          <w:trHeight w:val="321"/>
         </w:trPr>
         <w:tc>
           <w:tcPr>
-            <w:tcW w:w="2832" w:type="dxa"/>
+            <w:tcW w:w="2932" w:type="dxa"/>
             <w:tcBorders>
               <w:top w:val="nil"/>
               <w:left w:val="nil"/>
@@ -2461,7 +2461,7 @@
         </w:tc>
         <w:tc>
           <w:tcPr>
-            <w:tcW w:w="1190" w:type="dxa"/>
+            <w:tcW w:w="1232" w:type="dxa"/>
             <w:tcBorders>
               <w:top w:val="nil"/>
               <w:left w:val="nil"/>
@@ -2497,6 +2497,96 @@
           </w:p>
         </w:tc>
       </w:tr>
+      <w:tr>
+        <w:trPr>
+          <w:trHeight w:val="321"/>
+        </w:trPr>
+        <w:tc>
+          <w:tcPr>
+            <w:tcW w:w="2932" w:type="dxa"/>
+            <w:tcBorders>
+              <w:top w:val="nil"/>
+              <w:left w:val="nil"/>
+              <w:bottom w:val="nil"/>
+              <w:right w:val="nil"/>
+            </w:tcBorders>
+          </w:tcPr>
+          <w:p>
+            <w:pPr>
+              <w:autoSpaceDE w:val="0"/>
+              <w:autoSpaceDN w:val="0"/>
+              <w:adjustRightInd w:val="0"/>
+              <w:spacing w:after="0" w:line="240" w:lineRule="auto"/>
+              <w:rPr>
+                <w:rFonts w:ascii="Aptos Narrow" w:hAnsi="Aptos Narrow" w:cs="Aptos Narrow"/>
+                <w:color w:val="000000"/>
+                <w:kern w:val="0"/>
+                <w:sz w:val="22"/>
+                <w:szCs w:val="22"/>
+              </w:rPr>
+            </w:pPr>
+            <w:proofErr w:type="spellStart"/>
+            <w:r>
+              <w:rPr>
+                <w:rFonts w:ascii="Aptos Narrow" w:hAnsi="Aptos Narrow" w:cs="Aptos Narrow"/>
+                <w:color w:val="000000"/>
+                <w:kern w:val="0"/>
+                <w:sz w:val="22"/>
+                <w:szCs w:val="22"/>
+              </w:rPr>
+              <w:t>Resitors</w:t>
+            </w:r>
+            <w:proofErr w:type="spellEnd"/>
+            <w:r>
+              <w:rPr>
+                <w:rFonts w:ascii="Aptos Narrow" w:hAnsi="Aptos Narrow" w:cs="Aptos Narrow"/>
+                <w:color w:val="000000"/>
+                <w:kern w:val="0"/>
+                <w:sz w:val="22"/>
+                <w:szCs w:val="22"/>
+              </w:rPr>
+              <w:t xml:space="preserve"> (330 Ohms)</w:t>
+            </w:r>
+          </w:p>
+        </w:tc>
+        <w:tc>
+          <w:tcPr>
+            <w:tcW w:w="1232" w:type="dxa"/>
+            <w:tcBorders>
+              <w:top w:val="nil"/>
+              <w:left w:val="nil"/>
+              <w:bottom w:val="nil"/>
+              <w:right w:val="nil"/>
+            </w:tcBorders>
+          </w:tcPr>
+          <w:p>
+            <w:pPr>
+              <w:autoSpaceDE w:val="0"/>
+              <w:autoSpaceDN w:val="0"/>
+              <w:adjustRightInd w:val="0"/>
+              <w:spacing w:after="0" w:line="240" w:lineRule="auto"/>
+              <w:jc w:val="right"/>
+              <w:rPr>
+                <w:rFonts w:ascii="Aptos Narrow" w:hAnsi="Aptos Narrow" w:cs="Aptos Narrow"/>
+                <w:color w:val="000000"/>
+                <w:kern w:val="0"/>
+                <w:sz w:val="22"/>
+                <w:szCs w:val="22"/>
+              </w:rPr>
+            </w:pPr>
+            <w:r>
+              <w:rPr>
+                <w:rFonts w:ascii="Aptos Narrow" w:hAnsi="Aptos Narrow" w:cs="Aptos Narrow"/>
+                <w:color w:val="000000"/>
+                <w:kern w:val="0"/>
+                <w:sz w:val="22"/>
+                <w:szCs w:val="22"/>
+              </w:rPr>
+              <w:t>3</w:t>
+            </w:r>
+          </w:p>
+        </w:tc>
+      </w:tr>
     </w:tbl>
     <w:p>
       <w:pPr>
@@ -2507,10 +2597,119 @@
           <w:szCs w:val="36"/>
         </w:rPr>
       </w:pPr>
+      <w:r>
+        <w:rPr>
+          <w:b/>
+          <w:bCs/>
+          <w:sz w:val="36"/>
+          <w:szCs w:val="36"/>
+        </w:rPr>
+        <w:t xml:space="preserve"> </w:t>
+      </w:r>
     </w:p>
     <w:p>
       <w:r>
         <w:t>Pico Wireless so that it can communicate with Unity.</w:t>
+      </w:r>
+    </w:p>
+    <w:p/>
+    <w:p/>
+    <w:p>
+      <w:pPr>
+        <w:rPr>
+          <w:b/>
+          <w:bCs/>
+          <w:sz w:val="36"/>
+          <w:szCs w:val="36"/>
+        </w:rPr>
+      </w:pPr>
+      <w:r>
+        <w:rPr>
+          <w:b/>
+          <w:bCs/>
+          <w:sz w:val="36"/>
+          <w:szCs w:val="36"/>
+        </w:rPr>
+        <w:t>Redesign?</w:t>
+      </w:r>
+    </w:p>
+    <w:p>
+      <w:hyperlink r:id="rId73" w:history="1">
+        <w:r>
+          <w:rPr>
+            <w:rStyle w:val="Hyperlink"/>
+          </w:rPr>
+          <w:t>https://www.youtube.com/watch?v=aYkh6BrsPpQ</w:t>
+        </w:r>
+      </w:hyperlink>
+    </w:p>
+    <w:p>
+      <w:r>
+        <w:t xml:space="preserve">This video showcases how a switchboard operator would use the device to take calls. The controller design should resemble this more closely. </w:t>
+      </w:r>
+    </w:p>
+    <w:p>
+      <w:r>
+        <w:t>Some points:</w:t>
+      </w:r>
+    </w:p>
+    <w:p>
+      <w:pPr>
+        <w:pStyle w:val="ListParagraph"/>
+        <w:numPr>
+          <w:ilvl w:val="0"/>
+          <w:numId w:val="1"/>
+        </w:numPr>
+      </w:pPr>
+      <w:r>
+        <w:t xml:space="preserve">With the cables already inside the device, </w:t>
+      </w:r>
+      <w:r>
+        <w:t>the player does not need to worry about plugging both ends of a cable.</w:t>
+      </w:r>
+    </w:p>
+    <w:p/>
+    <w:p/>
+    <w:p>
+      <w:r>
+        <w:t>Need a jack that with an “isolated detection switch”</w:t>
+      </w:r>
+    </w:p>
+    <w:p>
+      <w:hyperlink r:id="rId74" w:history="1">
+        <w:r>
+          <w:rPr>
+            <w:rStyle w:val="Hyperlink"/>
+          </w:rPr>
+          <w:t>https://forums.raspberrypi.com/viewtopic.php?t=12512</w:t>
+        </w:r>
+      </w:hyperlink>
+    </w:p>
+    <w:p>
+      <w:hyperlink r:id="rId75" w:anchor="tab_description" w:history="1">
+        <w:r>
+          <w:rPr>
+            <w:rStyle w:val="Hyperlink"/>
+          </w:rPr>
+          <w:t>https://cricklewoodelectronics.com/3.5mm-Mono-Switched-Chassis-Socket.html#tab_description</w:t>
+        </w:r>
+      </w:hyperlink>
+      <w:r>
+        <w:t xml:space="preserve"> </w:t>
+      </w:r>
+    </w:p>
+    <w:p/>
+    <w:p>
+      <w:hyperlink r:id="rId76" w:history="1">
+        <w:r>
+          <w:rPr>
+            <w:rStyle w:val="Hyperlink"/>
+          </w:rPr>
+          <w:t>https://cricklewoodelectronics.com/Transparent-3.5mm-Stereo-Switched-Panel-Chassis-Socket-with-Mounting-Nut.html#tab_description</w:t>
+        </w:r>
+      </w:hyperlink>
+      <w:r>
+        <w:t xml:space="preserve"> </w:t>
       </w:r>
     </w:p>
     <w:sectPr>
@@ -3654,6 +3853,29 @@
     <w:uiPriority w:val="99"/>
     <w:rsid w:val="006A6460"/>
   </w:style>
+  <w:style w:type="character" w:styleId="Hyperlink">
+    <w:name w:val="Hyperlink"/>
+    <w:basedOn w:val="DefaultParagraphFont"/>
+    <w:uiPriority w:val="99"/>
+    <w:unhideWhenUsed/>
+    <w:rsid w:val="00D66C3D"/>
+    <w:rPr>
+      <w:color w:val="467886" w:themeColor="hyperlink"/>
+      <w:u w:val="single"/>
+    </w:rPr>
+  </w:style>
+  <w:style w:type="character" w:styleId="UnresolvedMention">
+    <w:name w:val="Unresolved Mention"/>
+    <w:basedOn w:val="DefaultParagraphFont"/>
+    <w:uiPriority w:val="99"/>
+    <w:semiHidden/>
+    <w:unhideWhenUsed/>
+    <w:rsid w:val="00D66C3D"/>
+    <w:rPr>
+      <w:color w:val="605E5C"/>
+      <w:shd w:val="clear" w:color="auto" w:fill="E1DFDD"/>
+    </w:rPr>
+  </w:style>
 </w:styles>
 </file>
 
@@ -3758,7 +3980,7 @@
   <inkml:trace contextRef="#ctx0" brushRef="#br0">199 334 9124,'0'0'9434,"-4"-4"-8898,1 2-453,-1-1 1,0 1-1,0 0 0,0 0 1,0 0-1,0 0 0,0 1 0,0 0 1,-1 0-1,1 0 0,0 0 1,-1 1-1,1-1 0,-1 1 1,1 0-1,0 1 0,-9 1 0,10-2-88,0 0-1,1 1 1,-1-1-1,0 1 1,1 0 0,-1 0-1,0 0 1,1 0-1,0 0 1,-1 1-1,1-1 1,0 1-1,-1-1 1,1 1-1,0 0 1,0 0-1,0 0 1,1 0-1,-1 0 1,0 0-1,1 1 1,0-1-1,-1 1 1,1-1-1,0 1 1,0-1-1,0 1 1,1-1-1,-1 1 1,0 0-1,1 0 1,0-1-1,0 1 1,0 0-1,0-1 1,0 1 0,0 0-1,1 0 1,-1-1-1,1 1 1,0 0-1,0-1 1,0 1-1,0-1 1,0 1-1,1-1 1,-1 0-1,1 1 1,-1-1-1,1 0 1,0 0-1,0 0 1,3 2-1,9 6-41,1 0 0,1-1 0,-1-1 0,21 8 0,34 17 437,-69-32-306,-1-1 0,1 0-1,0 1 1,0-1 0,-1 0 0,1 1 0,0-1 0,-1 1-1,1-1 1,-1 1 0,1-1 0,-1 1 0,1 0 0,-1-1-1,1 1 1,-1 0 0,1-1 0,-1 1 0,0 0-1,1 0 1,-1-1 0,0 1 0,0 0 0,0 0 0,0 0-1,1-1 1,-1 1 0,0 0 0,0 0 0,-1 0-1,1 1-7,-1-1 0,0 1 0,0-1-1,0 1 1,0-1 0,0 0 0,0 1-1,0-1 1,-1 0 0,1 0 0,0 0-1,-1 0 1,-1 1 0,-6 3 16,0-1-1,0 1 1,-17 4 0,1-3-162,1-2 0,-1 0 0,-30 0 0,27-3-3520,1-1-3526</inkml:trace>
   <inkml:trace contextRef="#ctx0" brushRef="#br0" timeOffset="468.15">472 218 11845,'0'0'5883,"-4"-1"-5677,3 1-185,0 0 0,1 0 0,-1 0 0,0 0 0,0 0 0,0 0 0,0 0 0,0 0 0,0 1 0,1-1 0,-1 0 0,0 0 1,0 1-1,0-1 0,1 0 0,-1 1 0,0-1 0,0 1 0,1-1 0,-1 1 0,0 0 0,1-1 0,-1 1 0,0 0 1,1-1-1,-1 1 0,1 0 0,-1 1 0,-15 36 699,10-15 28,-4 36 1,8-42-515,1 1 0,0 0 1,1-1-1,1 1 1,5 30-1,-5-44-260,0 1 1,0-1-1,0 1 0,1-1 0,0 0 0,0 1 1,0-1-1,0 0 0,1 0 0,-1 0 0,1-1 0,0 1 1,0-1-1,1 1 0,-1-1 0,1 0 0,-1 0 1,1-1-1,0 1 0,0-1 0,0 0 0,0 0 0,1 0 1,-1 0-1,0-1 0,8 2 0,-7-2-373,-1 0 0,0-1 0,0 1 0,1-1 0,-1 0 0,0 0 0,1-1 0,-1 1 0,0-1 0,0 0-1,0 0 1,0 0 0,0-1 0,0 1 0,0-1 0,0 0 0,0 0 0,3-3 0,19-19-6079</inkml:trace>
   <inkml:trace contextRef="#ctx0" brushRef="#br0" timeOffset="731.01">397 381 9012,'0'0'11285,"24"0"-10981,4 0-31,2 0 15,5 0-272,-1 0-16,2-2-80,-4 1-977,-1 1-1712,-2 0-2722</inkml:trace>
-  <inkml:trace contextRef="#ctx0" brushRef="#br0" timeOffset="1057.12">770 508 9060,'0'0'9188,"-3"-15"-7795,3-2-224,0-3-305,0 1-240,0 4-208,2 3-416,-1 4-32,1 3-1232,0 1-2514</inkml:trace>
+  <inkml:trace contextRef="#ctx0" brushRef="#br0" timeOffset="1057.1">770 508 9060,'0'0'9188,"-3"-15"-7795,3-2-224,0-3-305,0 1-240,0 4-208,2 3-416,-1 4-32,1 3-1232,0 1-2514</inkml:trace>
   <inkml:trace contextRef="#ctx0" brushRef="#br0" timeOffset="1304.94">805 178 7571,'0'0'15111,"-10"-3"-22746,12 20 288</inkml:trace>
   <inkml:trace contextRef="#ctx0" brushRef="#br0" timeOffset="1741.94">1098 323 10373,'0'0'6792,"-4"-2"-6165,-2 1-454,1-1 0,-1 1 0,0 0 0,0 0 0,0 0 1,0 1-1,0 0 0,0 0 0,0 0 0,0 1 0,1 0 0,-1 0 0,0 1 0,0-1 0,1 1 0,-1 1 0,1-1 0,-1 1 0,1 0 0,-9 6 0,9-5-117,-1 0 0,1 1 0,-1-1-1,2 1 1,-1 0 0,0 1-1,1-1 1,0 1 0,0 0 0,1 0-1,0 0 1,0 0 0,0 1-1,1-1 1,-1 1 0,2-1 0,-1 1-1,0 8 1,1-10-56,1 0-1,0 0 1,0 0-1,0 0 1,1-1 0,-1 1-1,1 0 1,0 0-1,1-1 1,1 6 0,-1-7-12,-1-1 1,1 0 0,0 0 0,0 0-1,-1 0 1,1 0 0,1 0 0,-1-1 0,0 1-1,0-1 1,0 1 0,1-1 0,-1 0-1,1 0 1,-1 0 0,1 0 0,0 0 0,-1 0-1,1-1 1,2 1 0,4 0-124,0 0 0,0 0 0,1-1 0,-1 0 0,0-1 0,0 0 1,0 0-1,0-1 0,15-4 0,-6-1-1748,-1-1 1,0-1 0,26-17-1,-15 8-4008</inkml:trace>
   <inkml:trace contextRef="#ctx0" brushRef="#br0" timeOffset="2602.75">1291 0 12534,'0'0'3449,"-1"6"-3291,-30 159 2654,12-74-1724,-7 106 1,22-176-591,2-13 20,1-10 731,3-1-1216,-1-1 0,1 0 1,0 0-1,1 1 0,-1-1 1,0 1-1,1 0 0,0-1 1,0 1-1,0 0 0,0 1 1,6-5-1,6-7-39,0-1-13,0 1 0,1 0 0,1 1 0,26-15 0,77-36-532,-105 57 415,-3-1 138,-21 8 19,-24 9-97,13-1 201,0 0 0,0 2 1,1 0-1,0 2 0,1 0 1,0 1-1,-22 20 1,38-31-82,0 1 0,1-1 0,-1 0 0,1 0 0,-1 1 0,1-1 0,0 1 0,0-1 0,0 1 1,0-1-1,0 1 0,0 0 0,1-1 0,-1 1 0,1 0 0,0 0 0,0-1 0,0 1 0,0 0 0,1 0 1,-1-1-1,1 1 0,-1 0 0,1-1 0,0 1 0,0 0 0,2 2 0,-1 0 5,1-1-1,0 0 1,0 0 0,0 0-1,1 0 1,-1 0 0,1-1-1,0 0 1,0 0 0,0 0-1,1 0 1,-1 0 0,9 3-1,7-1-183,-1-1 1,1 0-1,0-1 0,0-2 0,0 0 1,-1-1-1,29-3 0,-21 1-940,-18 2 191,-1-1 1,1 0-1,0-1 0,-1 0 0,0 0 0,11-5 0,14-8-5764</inkml:trace>

</xml_diff>

<commit_message>
Measured components, started tinkercad
</commit_message>
<xml_diff>
--- a/FYP Controller Design.docx
+++ b/FYP Controller Design.docx
@@ -81,7 +81,7 @@
           <w:noProof/>
         </w:rPr>
         <w:drawing>
-          <wp:inline distT="0" distB="0" distL="0" distR="0" wp14:anchorId="13900A38" wp14:editId="18831F45">
+          <wp:inline distT="0" distB="0" distL="0" distR="0" wp14:anchorId="13900A38" wp14:editId="1156E65C">
             <wp:extent cx="2138818" cy="2000250"/>
             <wp:effectExtent l="0" t="0" r="0" b="0"/>
             <wp:docPr id="1614353464" name="Picture 2" descr="8,163 Old Network Cable Stock Photos - Free &amp; Royalty-Free Stock Photos  from Dreamstime"/>
@@ -2525,7 +2525,6 @@
                 <w:szCs w:val="22"/>
               </w:rPr>
             </w:pPr>
-            <w:proofErr w:type="spellStart"/>
             <w:r>
               <w:rPr>
                 <w:rFonts w:ascii="Aptos Narrow" w:hAnsi="Aptos Narrow" w:cs="Aptos Narrow"/>
@@ -2534,18 +2533,7 @@
                 <w:sz w:val="22"/>
                 <w:szCs w:val="22"/>
               </w:rPr>
-              <w:t>Resitors</w:t>
-            </w:r>
-            <w:proofErr w:type="spellEnd"/>
-            <w:r>
-              <w:rPr>
-                <w:rFonts w:ascii="Aptos Narrow" w:hAnsi="Aptos Narrow" w:cs="Aptos Narrow"/>
-                <w:color w:val="000000"/>
-                <w:kern w:val="0"/>
-                <w:sz w:val="22"/>
-                <w:szCs w:val="22"/>
-              </w:rPr>
-              <w:t xml:space="preserve"> (330 Ohms)</w:t>
+              <w:t>Resitors (330 Ohms)</w:t>
             </w:r>
           </w:p>
         </w:tc>
@@ -2739,11 +2727,189 @@
           <w:rPr>
             <w:rStyle w:val="Hyperlink"/>
           </w:rPr>
-          <w:t>https://cricklewoodelectronics.com/Transparent-3.5mm-Stereo-Switched-Panel-Chassis-Socket-with-Mounting-Nut.html#tab_description</w:t>
+          <w:t>https://cricklewoodelectronics.com/Trans</w:t>
+        </w:r>
+        <w:r>
+          <w:rPr>
+            <w:rStyle w:val="Hyperlink"/>
+          </w:rPr>
+          <w:t>p</w:t>
+        </w:r>
+        <w:r>
+          <w:rPr>
+            <w:rStyle w:val="Hyperlink"/>
+          </w:rPr>
+          <w:t>arent-3.5mm-Stereo-Switched-Panel-Chassis-Socket-with-Mounting-Nut.html#tab_description</w:t>
         </w:r>
       </w:hyperlink>
       <w:r>
         <w:t xml:space="preserve"> </w:t>
+      </w:r>
+    </w:p>
+    <w:p/>
+    <w:p>
+      <w:r>
+        <w:t>COMPONENT DIMENSIONS</w:t>
+      </w:r>
+    </w:p>
+    <w:p>
+      <w:r>
+        <w:t>Red button – 28 mm diameter</w:t>
+      </w:r>
+    </w:p>
+    <w:p>
+      <w:r>
+        <w:t>Audio</w:t>
+      </w:r>
+      <w:r>
+        <w:t xml:space="preserve"> jack – 5mm diameter</w:t>
+      </w:r>
+    </w:p>
+    <w:p>
+      <w:r>
+        <w:t>Audio</w:t>
+      </w:r>
+      <w:r>
+        <w:t xml:space="preserve"> jack ring – 8mm diameter</w:t>
+      </w:r>
+    </w:p>
+    <w:p>
+      <w:r>
+        <w:t>Pot knob – 24mm diameter</w:t>
+      </w:r>
+    </w:p>
+    <w:p>
+      <w:r>
+        <w:t>Potentiometer base – 6-7mm diameter</w:t>
+      </w:r>
+    </w:p>
+    <w:p>
+      <w:r>
+        <w:t>LED – 5mm diameter</w:t>
+      </w:r>
+    </w:p>
+    <w:p>
+      <w:r>
+        <w:t>Audio cable metal barrel – 8mm diameter</w:t>
+      </w:r>
+    </w:p>
+    <w:p>
+      <w:r>
+        <w:t>Audio cable – 3mm diameter</w:t>
+      </w:r>
+    </w:p>
+    <w:p>
+      <w:r>
+        <w:rPr>
+          <w:noProof/>
+        </w:rPr>
+        <w:lastRenderedPageBreak/>
+        <w:drawing>
+          <wp:inline distT="0" distB="0" distL="0" distR="0" wp14:anchorId="1E193AA3" wp14:editId="50C0617D">
+            <wp:extent cx="3550920" cy="1964338"/>
+            <wp:effectExtent l="0" t="0" r="0" b="0"/>
+            <wp:docPr id="410958410" name="Picture 2" descr="A red rectangular object with different sizes and shapes&#10;&#10;AI-generated content may be incorrect."/>
+            <wp:cNvGraphicFramePr>
+              <a:graphicFrameLocks xmlns:a="http://schemas.openxmlformats.org/drawingml/2006/main" noChangeAspect="1"/>
+            </wp:cNvGraphicFramePr>
+            <a:graphic xmlns:a="http://schemas.openxmlformats.org/drawingml/2006/main">
+              <a:graphicData uri="http://schemas.openxmlformats.org/drawingml/2006/picture">
+                <pic:pic xmlns:pic="http://schemas.openxmlformats.org/drawingml/2006/picture">
+                  <pic:nvPicPr>
+                    <pic:cNvPr id="410958410" name="Picture 2" descr="A red rectangular object with different sizes and shapes&#10;&#10;AI-generated content may be incorrect."/>
+                    <pic:cNvPicPr>
+                      <a:picLocks noChangeAspect="1" noChangeArrowheads="1"/>
+                    </pic:cNvPicPr>
+                  </pic:nvPicPr>
+                  <pic:blipFill>
+                    <a:blip r:embed="rId78" cstate="print">
+                      <a:extLst>
+                        <a:ext uri="{28A0092B-C50C-407E-A947-70E740481C1C}">
+                          <a14:useLocalDpi xmlns:a14="http://schemas.microsoft.com/office/drawing/2010/main" val="0"/>
+                        </a:ext>
+                      </a:extLst>
+                    </a:blip>
+                    <a:srcRect/>
+                    <a:stretch>
+                      <a:fillRect/>
+                    </a:stretch>
+                  </pic:blipFill>
+                  <pic:spPr bwMode="auto">
+                    <a:xfrm>
+                      <a:off x="0" y="0"/>
+                      <a:ext cx="3559562" cy="1969119"/>
+                    </a:xfrm>
+                    <a:prstGeom prst="rect">
+                      <a:avLst/>
+                    </a:prstGeom>
+                    <a:noFill/>
+                    <a:ln>
+                      <a:noFill/>
+                    </a:ln>
+                  </pic:spPr>
+                </pic:pic>
+              </a:graphicData>
+            </a:graphic>
+          </wp:inline>
+        </w:drawing>
+      </w:r>
+      <w:r>
+        <w:rPr>
+          <w:noProof/>
+        </w:rPr>
+        <w:drawing>
+          <wp:inline distT="0" distB="0" distL="0" distR="0" wp14:anchorId="31EDE2A2" wp14:editId="34F25C01">
+            <wp:extent cx="3542574" cy="1783080"/>
+            <wp:effectExtent l="0" t="0" r="1270" b="7620"/>
+            <wp:docPr id="2123420259" name="Picture 1"/>
+            <wp:cNvGraphicFramePr>
+              <a:graphicFrameLocks xmlns:a="http://schemas.openxmlformats.org/drawingml/2006/main" noChangeAspect="1"/>
+            </wp:cNvGraphicFramePr>
+            <a:graphic xmlns:a="http://schemas.openxmlformats.org/drawingml/2006/main">
+              <a:graphicData uri="http://schemas.openxmlformats.org/drawingml/2006/picture">
+                <pic:pic xmlns:pic="http://schemas.openxmlformats.org/drawingml/2006/picture">
+                  <pic:nvPicPr>
+                    <pic:cNvPr id="0" name="Picture 1"/>
+                    <pic:cNvPicPr>
+                      <a:picLocks noChangeAspect="1" noChangeArrowheads="1"/>
+                    </pic:cNvPicPr>
+                  </pic:nvPicPr>
+                  <pic:blipFill>
+                    <a:blip r:embed="rId79" cstate="print">
+                      <a:extLst>
+                        <a:ext uri="{28A0092B-C50C-407E-A947-70E740481C1C}">
+                          <a14:useLocalDpi xmlns:a14="http://schemas.microsoft.com/office/drawing/2010/main" val="0"/>
+                        </a:ext>
+                      </a:extLst>
+                    </a:blip>
+                    <a:srcRect/>
+                    <a:stretch>
+                      <a:fillRect/>
+                    </a:stretch>
+                  </pic:blipFill>
+                  <pic:spPr bwMode="auto">
+                    <a:xfrm>
+                      <a:off x="0" y="0"/>
+                      <a:ext cx="3542574" cy="1783080"/>
+                    </a:xfrm>
+                    <a:prstGeom prst="rect">
+                      <a:avLst/>
+                    </a:prstGeom>
+                    <a:noFill/>
+                    <a:ln>
+                      <a:noFill/>
+                    </a:ln>
+                  </pic:spPr>
+                </pic:pic>
+              </a:graphicData>
+            </a:graphic>
+          </wp:inline>
+        </w:drawing>
+      </w:r>
+    </w:p>
+    <w:p>
+      <w:r>
+        <w:t>The LEDs along the audio jacks, if they stuck out so much, would sort of block the way into the jacks for the player.</w:t>
       </w:r>
     </w:p>
     <w:sectPr>
@@ -3910,6 +4076,18 @@
       <w:shd w:val="clear" w:color="auto" w:fill="E1DFDD"/>
     </w:rPr>
   </w:style>
+  <w:style w:type="character" w:styleId="FollowedHyperlink">
+    <w:name w:val="FollowedHyperlink"/>
+    <w:basedOn w:val="DefaultParagraphFont"/>
+    <w:uiPriority w:val="99"/>
+    <w:semiHidden/>
+    <w:unhideWhenUsed/>
+    <w:rsid w:val="004515E1"/>
+    <w:rPr>
+      <w:color w:val="96607D" w:themeColor="followedHyperlink"/>
+      <w:u w:val="single"/>
+    </w:rPr>
+  </w:style>
 </w:styles>
 </file>
 
@@ -4014,7 +4192,7 @@
   <inkml:trace contextRef="#ctx0" brushRef="#br0">199 334 9124,'0'0'9434,"-4"-4"-8898,1 2-453,-1-1 1,0 1-1,0 0 0,0 0 1,0 0-1,0 0 0,0 1 0,0 0 1,-1 0-1,1 0 0,0 0 1,-1 1-1,1-1 0,-1 1 1,1 0-1,0 1 0,-9 1 0,10-2-88,0 0-1,1 1 1,-1-1-1,0 1 1,1 0 0,-1 0-1,0 0 1,1 0-1,0 0 1,-1 1-1,1-1 1,0 1-1,-1-1 1,1 1-1,0 0 1,0 0-1,0 0 1,1 0-1,-1 0 1,0 0-1,1 1 1,0-1-1,-1 1 1,1-1-1,0 1 1,0-1-1,0 1 1,1-1-1,-1 1 1,0 0-1,1 0 1,0-1-1,0 1 1,0 0-1,0-1 1,0 1 0,0 0-1,1 0 1,-1-1-1,1 1 1,0 0-1,0-1 1,0 1-1,0-1 1,0 1-1,1-1 1,-1 0-1,1 1 1,-1-1-1,1 0 1,0 0-1,0 0 1,3 2-1,9 6-41,1 0 0,1-1 0,-1-1 0,21 8 0,34 17 437,-69-32-306,-1-1 0,1 0-1,0 1 1,0-1 0,-1 0 0,1 1 0,0-1 0,-1 1-1,1-1 1,-1 1 0,1-1 0,-1 1 0,1 0 0,-1-1-1,1 1 1,-1 0 0,1-1 0,-1 1 0,0 0-1,1 0 1,-1-1 0,0 1 0,0 0 0,0 0 0,0 0-1,1-1 1,-1 1 0,0 0 0,0 0 0,-1 0-1,1 1-7,-1-1 0,0 1 0,0-1-1,0 1 1,0-1 0,0 0 0,0 1-1,0-1 1,-1 0 0,1 0 0,0 0-1,-1 0 1,-1 1 0,-6 3 16,0-1-1,0 1 1,-17 4 0,1-3-162,1-2 0,-1 0 0,-30 0 0,27-3-3520,1-1-3526</inkml:trace>
   <inkml:trace contextRef="#ctx0" brushRef="#br0" timeOffset="468.15">472 218 11845,'0'0'5883,"-4"-1"-5677,3 1-185,0 0 0,1 0 0,-1 0 0,0 0 0,0 0 0,0 0 0,0 0 0,0 0 0,0 1 0,1-1 0,-1 0 0,0 0 1,0 1-1,0-1 0,1 0 0,-1 1 0,0-1 0,0 1 0,1-1 0,-1 1 0,0 0 0,1-1 0,-1 1 0,0 0 1,1-1-1,-1 1 0,1 0 0,-1 1 0,-15 36 699,10-15 28,-4 36 1,8-42-515,1 1 0,0 0 1,1-1-1,1 1 1,5 30-1,-5-44-260,0 1 1,0-1-1,0 1 0,1-1 0,0 0 0,0 1 1,0-1-1,0 0 0,1 0 0,-1 0 0,1-1 0,0 1 1,0-1-1,1 1 0,-1-1 0,1 0 0,-1 0 1,1-1-1,0 1 0,0-1 0,0 0 0,0 0 0,1 0 1,-1 0-1,0-1 0,8 2 0,-7-2-373,-1 0 0,0-1 0,0 1 0,1-1 0,-1 0 0,0 0 0,1-1 0,-1 1 0,0-1 0,0 0-1,0 0 1,0 0 0,0-1 0,0 1 0,0-1 0,0 0 0,0 0 0,3-3 0,19-19-6079</inkml:trace>
   <inkml:trace contextRef="#ctx0" brushRef="#br0" timeOffset="731.01">397 381 9012,'0'0'11285,"24"0"-10981,4 0-31,2 0 15,5 0-272,-1 0-16,2-2-80,-4 1-977,-1 1-1712,-2 0-2722</inkml:trace>
-  <inkml:trace contextRef="#ctx0" brushRef="#br0" timeOffset="1057.09">770 508 9060,'0'0'9188,"-3"-15"-7795,3-2-224,0-3-305,0 1-240,0 4-208,2 3-416,-1 4-32,1 3-1232,0 1-2514</inkml:trace>
+  <inkml:trace contextRef="#ctx0" brushRef="#br0" timeOffset="1057.08">770 508 9060,'0'0'9188,"-3"-15"-7795,3-2-224,0-3-305,0 1-240,0 4-208,2 3-416,-1 4-32,1 3-1232,0 1-2514</inkml:trace>
   <inkml:trace contextRef="#ctx0" brushRef="#br0" timeOffset="1304.94">805 178 7571,'0'0'15111,"-10"-3"-22746,12 20 288</inkml:trace>
   <inkml:trace contextRef="#ctx0" brushRef="#br0" timeOffset="1741.94">1098 323 10373,'0'0'6792,"-4"-2"-6165,-2 1-454,1-1 0,-1 1 0,0 0 0,0 0 0,0 0 1,0 1-1,0 0 0,0 0 0,0 0 0,0 1 0,1 0 0,-1 0 0,0 1 0,0-1 0,1 1 0,-1 1 0,1-1 0,-1 1 0,1 0 0,-9 6 0,9-5-117,-1 0 0,1 1 0,-1-1-1,2 1 1,-1 0 0,0 1-1,1-1 1,0 1 0,0 0 0,1 0-1,0 0 1,0 0 0,0 1-1,1-1 1,-1 1 0,2-1 0,-1 1-1,0 8 1,1-10-56,1 0-1,0 0 1,0 0-1,0 0 1,1-1 0,-1 1-1,1 0 1,0 0-1,1-1 1,1 6 0,-1-7-12,-1-1 1,1 0 0,0 0 0,0 0-1,-1 0 1,1 0 0,1 0 0,-1-1 0,0 1-1,0-1 1,0 1 0,1-1 0,-1 0-1,1 0 1,-1 0 0,1 0 0,0 0 0,-1 0-1,1-1 1,2 1 0,4 0-124,0 0 0,0 0 0,1-1 0,-1 0 0,0-1 0,0 0 1,0 0-1,0-1 0,15-4 0,-6-1-1748,-1-1 1,0-1 0,26-17-1,-15 8-4008</inkml:trace>
   <inkml:trace contextRef="#ctx0" brushRef="#br0" timeOffset="2602.75">1291 0 12534,'0'0'3449,"-1"6"-3291,-30 159 2654,12-74-1724,-7 106 1,22-176-591,2-13 20,1-10 731,3-1-1216,-1-1 0,1 0 1,0 0-1,1 1 0,-1-1 1,0 1-1,1 0 0,0-1 1,0 1-1,0 0 0,0 1 1,6-5-1,6-7-39,0-1-13,0 1 0,1 0 0,1 1 0,26-15 0,77-36-532,-105 57 415,-3-1 138,-21 8 19,-24 9-97,13-1 201,0 0 0,0 2 1,1 0-1,0 2 0,1 0 1,0 1-1,-22 20 1,38-31-82,0 1 0,1-1 0,-1 0 0,1 0 0,-1 1 0,1-1 0,0 1 0,0-1 0,0 1 1,0-1-1,0 1 0,0 0 0,1-1 0,-1 1 0,1 0 0,0 0 0,0-1 0,0 1 0,0 0 0,1 0 1,-1-1-1,1 1 0,-1 0 0,1-1 0,0 1 0,0 0 0,2 2 0,-1 0 5,1-1-1,0 0 1,0 0 0,0 0-1,1 0 1,-1 0 0,1-1-1,0 0 1,0 0 0,0 0-1,1 0 1,-1 0 0,9 3-1,7-1-183,-1-1 1,1 0-1,0-1 0,0-2 0,0 0 1,-1-1-1,29-3 0,-21 1-940,-18 2 191,-1-1 1,1 0-1,0-1 0,-1 0 0,0 0 0,11-5 0,14-8-5764</inkml:trace>

</xml_diff>

<commit_message>
imported serial godot proj
</commit_message>
<xml_diff>
--- a/FYP Controller Design.docx
+++ b/FYP Controller Design.docx
@@ -81,7 +81,7 @@
           <w:noProof/>
         </w:rPr>
         <w:drawing>
-          <wp:inline distT="0" distB="0" distL="0" distR="0" wp14:anchorId="13900A38" wp14:editId="337F074F">
+          <wp:inline distT="0" distB="0" distL="0" distR="0" wp14:anchorId="13900A38" wp14:editId="574F6337">
             <wp:extent cx="2138818" cy="2000250"/>
             <wp:effectExtent l="0" t="0" r="0" b="0"/>
             <wp:docPr id="1614353464" name="Picture 2" descr="8,163 Old Network Cable Stock Photos - Free &amp; Royalty-Free Stock Photos  from Dreamstime"/>
@@ -3026,27 +3026,7 @@
           <w:sz w:val="28"/>
           <w:szCs w:val="28"/>
         </w:rPr>
-        <w:t xml:space="preserve">Thinking about </w:t>
-      </w:r>
-      <w:proofErr w:type="gramStart"/>
-      <w:r>
-        <w:rPr>
-          <w:b/>
-          <w:bCs/>
-          <w:sz w:val="28"/>
-          <w:szCs w:val="28"/>
-        </w:rPr>
-        <w:t>bi directional</w:t>
-      </w:r>
-      <w:proofErr w:type="gramEnd"/>
-      <w:r>
-        <w:rPr>
-          <w:b/>
-          <w:bCs/>
-          <w:sz w:val="28"/>
-          <w:szCs w:val="28"/>
-        </w:rPr>
-        <w:t xml:space="preserve"> serial communication:</w:t>
+        <w:t>Thinking about bi directional serial communication:</w:t>
       </w:r>
     </w:p>
     <w:p>
@@ -3238,17 +3218,173 @@
           <w:sz w:val="28"/>
           <w:szCs w:val="28"/>
         </w:rPr>
-        <w:t xml:space="preserve">Game will tell them to turn off as </w:t>
-      </w:r>
-      <w:proofErr w:type="gramStart"/>
-      <w:r>
-        <w:rPr>
-          <w:sz w:val="28"/>
-          <w:szCs w:val="28"/>
-        </w:rPr>
-        <w:t>well.</w:t>
-      </w:r>
-      <w:proofErr w:type="gramEnd"/>
+        <w:t>Game will tell them to turn off as well.</w:t>
+      </w:r>
+    </w:p>
+    <w:p>
+      <w:pPr>
+        <w:rPr>
+          <w:sz w:val="28"/>
+          <w:szCs w:val="28"/>
+        </w:rPr>
+      </w:pPr>
+    </w:p>
+    <w:p>
+      <w:pPr>
+        <w:rPr>
+          <w:sz w:val="28"/>
+          <w:szCs w:val="28"/>
+        </w:rPr>
+      </w:pPr>
+      <w:r>
+        <w:rPr>
+          <w:sz w:val="28"/>
+          <w:szCs w:val="28"/>
+        </w:rPr>
+        <w:t>--</w:t>
+      </w:r>
+    </w:p>
+    <w:p>
+      <w:pPr>
+        <w:rPr>
+          <w:sz w:val="28"/>
+          <w:szCs w:val="28"/>
+        </w:rPr>
+      </w:pPr>
+    </w:p>
+    <w:p>
+      <w:pPr>
+        <w:rPr>
+          <w:sz w:val="28"/>
+          <w:szCs w:val="28"/>
+        </w:rPr>
+      </w:pPr>
+      <w:r>
+        <w:rPr>
+          <w:sz w:val="28"/>
+          <w:szCs w:val="28"/>
+        </w:rPr>
+        <w:lastRenderedPageBreak/>
+        <w:t xml:space="preserve">Godot will also print to serial, however the output will have something specific, like a number at the beginning of the string, so that it doesn’t read the </w:t>
+      </w:r>
+      <w:r>
+        <w:rPr>
+          <w:sz w:val="28"/>
+          <w:szCs w:val="28"/>
+        </w:rPr>
+        <w:t>Pico’s</w:t>
+      </w:r>
+      <w:r>
+        <w:rPr>
+          <w:sz w:val="28"/>
+          <w:szCs w:val="28"/>
+        </w:rPr>
+        <w:t xml:space="preserve"> output. </w:t>
+      </w:r>
+    </w:p>
+    <w:p>
+      <w:pPr>
+        <w:rPr>
+          <w:sz w:val="28"/>
+          <w:szCs w:val="28"/>
+        </w:rPr>
+      </w:pPr>
+      <w:r>
+        <w:rPr>
+          <w:sz w:val="28"/>
+          <w:szCs w:val="28"/>
+        </w:rPr>
+        <w:t>Godot output – LEDs – which homes are calling.</w:t>
+      </w:r>
+    </w:p>
+    <w:p>
+      <w:pPr>
+        <w:rPr>
+          <w:b/>
+          <w:bCs/>
+          <w:sz w:val="28"/>
+          <w:szCs w:val="28"/>
+        </w:rPr>
+      </w:pPr>
+      <w:r>
+        <w:rPr>
+          <w:b/>
+          <w:bCs/>
+          <w:sz w:val="28"/>
+          <w:szCs w:val="28"/>
+        </w:rPr>
+        <w:t>BUTTON</w:t>
+      </w:r>
+    </w:p>
+    <w:p>
+      <w:pPr>
+        <w:rPr>
+          <w:sz w:val="28"/>
+          <w:szCs w:val="28"/>
+        </w:rPr>
+      </w:pPr>
+      <w:r>
+        <w:rPr>
+          <w:sz w:val="28"/>
+          <w:szCs w:val="28"/>
+        </w:rPr>
+        <w:t>Options:</w:t>
+      </w:r>
+    </w:p>
+    <w:p>
+      <w:pPr>
+        <w:pStyle w:val="ListParagraph"/>
+        <w:numPr>
+          <w:ilvl w:val="0"/>
+          <w:numId w:val="1"/>
+        </w:numPr>
+        <w:rPr>
+          <w:sz w:val="28"/>
+          <w:szCs w:val="28"/>
+        </w:rPr>
+      </w:pPr>
+      <w:r>
+        <w:rPr>
+          <w:sz w:val="28"/>
+          <w:szCs w:val="28"/>
+        </w:rPr>
+        <w:t xml:space="preserve">After pressing the button, the status is active for a short period. </w:t>
+      </w:r>
+      <w:r>
+        <w:rPr>
+          <w:sz w:val="28"/>
+          <w:szCs w:val="28"/>
+        </w:rPr>
+        <w:t>Basically,</w:t>
+      </w:r>
+      <w:r>
+        <w:rPr>
+          <w:sz w:val="28"/>
+          <w:szCs w:val="28"/>
+        </w:rPr>
+        <w:t xml:space="preserve"> there’s a cooldown period.</w:t>
+      </w:r>
+      <w:r>
+        <w:rPr>
+          <w:sz w:val="28"/>
+          <w:szCs w:val="28"/>
+        </w:rPr>
+        <w:t xml:space="preserve"> This simplifies things because Godot doesn’t have to tell Pico that it’s registered the button</w:t>
+      </w:r>
+      <w:r>
+        <w:rPr>
+          <w:sz w:val="28"/>
+          <w:szCs w:val="28"/>
+        </w:rPr>
+        <w:t xml:space="preserve"> press</w:t>
+      </w:r>
+      <w:r>
+        <w:rPr>
+          <w:sz w:val="28"/>
+          <w:szCs w:val="28"/>
+        </w:rPr>
+        <w:t>.</w:t>
+      </w:r>
     </w:p>
     <w:sectPr>
       <w:pgSz w:w="11906" w:h="16838"/>

</xml_diff>